<commit_message>
HR-19 F2: 006 ends benefits at month end, 005 flags Saver HSA FSA limit, 004 disability sequencing, 007 loss-of-coverage documentation, versioning wording, commuter monthly limit
Co-Authored-By: Claude Sonnet 5 <noreply@anthropic.com>
</commit_message>
<xml_diff>
--- a/artifacts/HR-19/build/benefits-plan-library-enrollment-calendar-and-life-events.docx
+++ b/artifacts/HR-19/build/benefits-plan-library-enrollment-calendar-and-life-events.docx
@@ -598,7 +598,7 @@
               <w:pStyle w:val="Compact"/>
             </w:pPr>
             <w:r>
-              <w:t xml:space="preserve">None</w:t>
+              <w:t xml:space="preserve">None for the event; a document for each dependent you add (section 6)</w:t>
             </w:r>
           </w:p>
         </w:tc>
@@ -876,7 +876,7 @@
               <w:pStyle w:val="Compact"/>
             </w:pPr>
             <w:r>
-              <w:t xml:space="preserve">Reissued for the 2026 plan year; published the next open enrollment window and the dependent documentation list.</w:t>
+              <w:t xml:space="preserve">Reissued for the 2026 plan year; published the next open enrollment window and restated the dependent documentation list.</w:t>
             </w:r>
           </w:p>
         </w:tc>

</xml_diff>